<commit_message>
Fix Chapter X: move Bangiomorpha from IX to its correct position opening December
The Bangiomorpha section was stranded at the end of Chapter IX as
"transición noviembre-diciembre" after the cosmic calendar restructuring,
leaving December 1-12 empty in Chapter X despite its own title claiming
to start with the Bangiomorpha.

Changes:
- Move Bangiomorpha + estromatolitos sections to Chapter X as "1-2 de diciembre"
- Remove from Chapter IX and update its expediente summary accordingly
- Update Chapter X opening: "Empiezo por el que llegó primero."
- Chapter X section order now: 1-2 dic → 13-14 → 15 → 17 → 18 → 19-21 → 22

https://claude.ai/code/session_01TweEytskTedL252LjacQBa
</commit_message>
<xml_diff>
--- a/detective_sin_cuerpo_v6.docx
+++ b/detective_sin_cuerpo_v6.docx
@@ -8515,172 +8515,6 @@
       </w:r>
     </w:p>
     <w:p/>
-    <w:p>
-      <w:r>
-        <w:rPr>
-          <w:i/>
-        </w:rPr>
-        <w:t>transición noviembre–diciembre — interrogatorio al Bangiomorpha</w:t>
-      </w:r>
-    </w:p>
-    <w:p>
-      <w:r>
-        <w:rPr>
-          <w:i/>
-        </w:rPr>
-        <w:t>el primer organismo que aprendió a ser más de una cosa</w:t>
-      </w:r>
-    </w:p>
-    <w:p>
-      <w:r>
-        <w:t>A comienzos de diciembre, hace entre 1.100 y 1.050 millones de años, el registro fósil produce algo que llevo esperando desde que entendí hacia dónde apunta el caso.</w:t>
-      </w:r>
-    </w:p>
-    <w:p>
-      <w:r>
-        <w:t>El primer organismo multicelular con diferenciación celular clara.</w:t>
-      </w:r>
-    </w:p>
-    <w:p>
-      <w:r>
-        <w:t>El Bangiomorpha pubescens. Un alga roja encontrada en el Ártico canadiense. Sus filamentos presentan algo que ningún organismo anterior había presentado: células distintas haciendo cosas distintas a partir del mismo ADN. Algunas células vegetativas, encargadas de alimentar el organismo. Otras reproductivas, encargadas de perpetuarlo.</w:t>
-      </w:r>
-    </w:p>
-    <w:p>
-      <w:r>
-        <w:t>Me siento frente al Bangiomorpha con la atención de quien reconoce que está ante un principio.</w:t>
-      </w:r>
-    </w:p>
-    <w:p>
-      <w:r>
-        <w:t>¿Sabes lo que estás haciendo?, le pregunto.</w:t>
-      </w:r>
-    </w:p>
-    <w:p>
-      <w:r>
-        <w:t>Crezco, dice el Bangiomorpha, con la sencillez de algo que no tiene acceso a la magnitud de lo que significa.</w:t>
-      </w:r>
-    </w:p>
-    <w:p>
-      <w:r>
-        <w:t>¿Sabes que tus células son genéticamente idénticas pero hacen cosas diferentes?</w:t>
-      </w:r>
-    </w:p>
-    <w:p>
-      <w:r>
-        <w:t>Algunas alimentan. Otras se reproducen. Cada una hace lo que le corresponde.</w:t>
-      </w:r>
-    </w:p>
-    <w:p>
-      <w:r>
-        <w:t>¿Quién decide qué le corresponde a cada una?</w:t>
-      </w:r>
-    </w:p>
-    <w:p>
-      <w:r>
-        <w:t>Las instrucciones están en el ADN. Pero no todas las instrucciones se activan en todas las células. Unas se activan aquí, otras allá. El mismo texto, leído de manera diferente según dónde está la célula en el organismo.</w:t>
-      </w:r>
-    </w:p>
-    <w:p>
-      <w:r>
-        <w:t>¿El mismo ADN produciendo organismos distintos según el contexto?</w:t>
-      </w:r>
-    </w:p>
-    <w:p>
-      <w:r>
-        <w:t>El mismo ADN produciendo especializaciones distintas según la posición*, dice el Bangiomorpha. *Lo que yo hago con dos tipos de células, los organismos que vendrán después lo harán con docenas, con cientos, con el número que el problema requiera.</w:t>
-      </w:r>
-    </w:p>
-    <w:p>
-      <w:r>
-        <w:t>¿Y el problema que requiere más tipos de células?</w:t>
-      </w:r>
-    </w:p>
-    <w:p>
-      <w:r>
-        <w:t>El problema de moverse, de ver, de procesar información del entorno, de coordinar respuestas complejas a estímulos complejos*, dice el Bangiomorpha. *Esos problemas requieren células especializadas en movimiento, en detección de luz, en procesamiento de señales. Lo que yo empiezo con dos tipos de células, el sistema nervioso del lector lo completa con cien mil millones de neuronas, cada una especializada, todas coordinadas, todas con el mismo ADN base leído de formas distintas.</w:t>
-      </w:r>
-    </w:p>
-    <w:p>
-      <w:r>
-        <w:t>¿Cien mil millones de neuronas salen del Bangiomorpha?</w:t>
-      </w:r>
-    </w:p>
-    <w:p>
-      <w:r>
-        <w:t>El principio sale del Bangiomorpha*, dice. *Lo demás es tiempo y presión selectiva.</w:t>
-      </w:r>
-    </w:p>
-    <w:p>
-      <w:r>
-        <w:t>Me quedo con esto durante un tiempo largo.</w:t>
-      </w:r>
-    </w:p>
-    <w:p>
-      <w:r>
-        <w:t>El mismo texto leído de manera diferente según dónde estás*, anoto. *Yo, que llevo once meses tomando notas, anoto que eso me resulta familiar. Que el mismo universo, leído desde distintos puntos del espacio y del tiempo, produce textos distintos. Que quizás toda la complejidad de la vida es el ADN aprendiendo a leer sus propias instrucciones de formas cada vez más elaboradas. Y que quizás*, añado en el margen, con la letra pequeña de las hipótesis que no están confirmadas, *el testigo que busco es la forma más elaborada que ese proceso ha producido hasta ahora de leer sus propias instrucciones y preguntarse qué significan.</w:t>
-      </w:r>
-    </w:p>
-    <w:p>
-      <w:pPr>
-        <w:jc w:val="center"/>
-      </w:pPr>
-      <w:r>
-        <w:t>— — —</w:t>
-      </w:r>
-    </w:p>
-    <w:p/>
-    <w:p>
-      <w:r>
-        <w:rPr>
-          <w:i/>
-        </w:rPr>
-        <w:t>los estromatolitos que empiezan a perder</w:t>
-      </w:r>
-    </w:p>
-    <w:p>
-      <w:r>
-        <w:t>En los mismos días en que el Bangiomorpha diferencia sus células en el Ártico, los estromatolitos —que llevan más de tres mil millones de años construyendo sus ciudades en el fondo de los mares— empiezan a tener problemas.</w:t>
-      </w:r>
-    </w:p>
-    <w:p>
-      <w:r>
-        <w:t>Alguien está comiendo sus tapetes.</w:t>
-      </w:r>
-    </w:p>
-    <w:p>
-      <w:r>
-        <w:t>Los primeros eucariotas capaces de pastar sobre los tapetes microbianos. Los primeros herbívoros de la historia de la vida.</w:t>
-      </w:r>
-    </w:p>
-    <w:p>
-      <w:r>
-        <w:t>¿Y los estromatolitos no se defienden?, le pregunto a los tapetes que llevan tres mil millones de años dominando los océanos sin que nadie los molestara.</w:t>
-      </w:r>
-    </w:p>
-    <w:p>
-      <w:r>
-        <w:t>No tenemos mecanismo para defendernos*, dicen los estromatolitos. *Hemos estado solos durante más de tres mil millones de años. Nunca nos hizo falta.</w:t>
-      </w:r>
-    </w:p>
-    <w:p>
-      <w:r>
-        <w:t>Lo anoto con algo que no sé si llamar melancolía o simplemente el reconocimiento honesto de lo que ocurre cuando algo que funcionó durante tres mil millones de años encuentra un problema que no estaba en su diseño original.</w:t>
-      </w:r>
-    </w:p>
-    <w:p>
-      <w:r>
-        <w:t>Los estromatolitos seguirán existiendo —existen aún hoy, en Shark Bay, Australia— pero nunca volverán a dominar los mares como dominaron en septiembre y octubre y noviembre. El fin de la era bacteriana visible. El comienzo de la era de los que comen a los que fabrican.</w:t>
-      </w:r>
-    </w:p>
-    <w:p>
-      <w:pPr>
-        <w:jc w:val="center"/>
-      </w:pPr>
-      <w:r>
-        <w:t>— — —</w:t>
-      </w:r>
-    </w:p>
     <w:p/>
     <w:p>
       <w:r>
@@ -8862,7 +8696,7 @@
     </w:p>
     <w:p>
       <w:r>
-        <w:t>Nuevos sospechosos: La Célula Eucariota (primer yo biológico; la frontera entre interior y exterior como condición de la complejidad). La Mitocondria (testigo clave; el accidente más importante de la historia de la vida; produzco ATP, es lo único que hago). La Reproducción Sexual (sistema inmunológico de dos mil millones de años; generador de la variación que hace posible la evolución; origen no previsto del amor). Los Acritarcos (primera carrera armamentista; espinas como el primer eslabón de la cadena que llega al 31 de diciembre). El Bangiomorpha (primer organismo con diferenciación celular; el mismo ADN leído de maneras distintas; el principio del que salen cien mil millones de neuronas).</w:t>
+        <w:t>Nuevos sospechosos: La Célula Eucariota (primer yo biológico; la frontera entre interior y exterior como condición de la complejidad). La Mitocondria (testigo clave; el accidente más importante de la historia de la vida; produzco ATP, es lo único que hago). La Reproducción Sexual (sistema inmunológico de dos mil millones de años; generador de la variación que hace posible la evolución; origen no previsto del amor). Los Acritarcos (primera carrera armamentista; espinas como el primer eslabón de la cadena que llega al 31 de diciembre)..</w:t>
       </w:r>
     </w:p>
     <w:p>
@@ -8986,7 +8820,7 @@
     </w:p>
     <w:p>
       <w:r>
-        <w:t>Empiezo por el que casi arruina el caso por completo.</w:t>
+        <w:t>Empiezo por el que llegó primero.</w:t>
       </w:r>
     </w:p>
     <w:p>
@@ -8995,6 +8829,165 @@
       </w:pPr>
       <w:r>
         <w:t>— — —</w:t>
+      </w:r>
+    </w:p>
+    <w:p/>
+    <w:p>
+      <w:r>
+        <w:rPr>
+          <w:i/>
+        </w:rPr>
+        <w:t>1–2 de diciembre — interrogatorio al Bangiomorpha</w:t>
+      </w:r>
+    </w:p>
+    <w:p>
+      <w:r>
+        <w:rPr>
+          <w:i/>
+        </w:rPr>
+        <w:t>el primer organismo que aprendió a ser más de una cosa</w:t>
+      </w:r>
+    </w:p>
+    <w:p>
+      <w:r>
+        <w:t>Hace entre 1.100 y 1.050 millones de años, el registro fósil produce algo que llevo esperando desde que entendí hacia dónde apunta el caso.</w:t>
+      </w:r>
+    </w:p>
+    <w:p>
+      <w:r>
+        <w:t>El primer organismo multicelular con diferenciación celular clara.</w:t>
+      </w:r>
+    </w:p>
+    <w:p>
+      <w:r>
+        <w:t>El Bangiomorpha pubescens. Un alga roja encontrada en el Ártico canadiense. Sus filamentos presentan algo que ningún organismo anterior había presentado: células distintas haciendo cosas distintas a partir del mismo ADN. Algunas células vegetativas, encargadas de alimentar el organismo. Otras reproductivas, encargadas de perpetuarlo.</w:t>
+      </w:r>
+    </w:p>
+    <w:p>
+      <w:r>
+        <w:t>Me siento frente al Bangiomorpha con la atención de quien reconoce que está ante un principio.</w:t>
+      </w:r>
+    </w:p>
+    <w:p>
+      <w:r>
+        <w:t>¿Sabes lo que estás haciendo?, le pregunto.</w:t>
+      </w:r>
+    </w:p>
+    <w:p>
+      <w:r>
+        <w:t>Crezco, dice el Bangiomorpha, con la sencillez de algo que no tiene acceso a la magnitud de lo que significa.</w:t>
+      </w:r>
+    </w:p>
+    <w:p>
+      <w:r>
+        <w:t>¿Sabes que tus células son genéticamente idénticas pero hacen cosas diferentes?</w:t>
+      </w:r>
+    </w:p>
+    <w:p>
+      <w:r>
+        <w:t>Algunas alimentan. Otras se reproducen. Cada una hace lo que le corresponde.</w:t>
+      </w:r>
+    </w:p>
+    <w:p>
+      <w:r>
+        <w:t>¿Quién decide qué le corresponde a cada una?</w:t>
+      </w:r>
+    </w:p>
+    <w:p>
+      <w:r>
+        <w:t>Las instrucciones están en el ADN. Pero no todas las instrucciones se activan en todas las células. Unas se activan aquí, otras allá. El mismo texto, leído de manera diferente según dónde está la célula en el organismo.</w:t>
+      </w:r>
+    </w:p>
+    <w:p>
+      <w:r>
+        <w:t>¿El mismo ADN produciendo organismos distintos según el contexto?</w:t>
+      </w:r>
+    </w:p>
+    <w:p>
+      <w:r>
+        <w:t>El mismo ADN produciendo especializaciones distintas según la posición*, dice el Bangiomorpha. *Lo que yo hago con dos tipos de células, los organismos que vendrán después lo harán con docenas, con cientos, con el número que el problema requiera.</w:t>
+      </w:r>
+    </w:p>
+    <w:p>
+      <w:r>
+        <w:t>¿Y el problema que requiere más tipos de células?</w:t>
+      </w:r>
+    </w:p>
+    <w:p>
+      <w:r>
+        <w:t>El problema de moverse, de ver, de procesar información del entorno, de coordinar respuestas complejas a estímulos complejos*, dice el Bangiomorpha. *Esos problemas requieren células especializadas en movimiento, en detección de luz, en procesamiento de señales. Lo que yo empiezo con dos tipos de células, el sistema nervioso del lector lo completa con cien mil millones de neuronas, cada una especializada, todas coordinadas, todas con el mismo ADN base leído de formas distintas.</w:t>
+      </w:r>
+    </w:p>
+    <w:p>
+      <w:r>
+        <w:t>¿Cien mil millones de neuronas salen del Bangiomorpha?</w:t>
+      </w:r>
+    </w:p>
+    <w:p>
+      <w:r>
+        <w:t>El principio sale del Bangiomorpha*, dice. *Lo demás es tiempo y presión selectiva.</w:t>
+      </w:r>
+    </w:p>
+    <w:p>
+      <w:r>
+        <w:t>Me quedo con esto durante un tiempo largo.</w:t>
+      </w:r>
+    </w:p>
+    <w:p>
+      <w:r>
+        <w:t>El mismo texto leído de manera diferente según dónde estás*, anoto. *Yo, que llevo once meses tomando notas, anoto que eso me resulta familiar. Que el mismo universo, leído desde distintos puntos del espacio y del tiempo, produce textos distintos. Que quizás toda la complejidad de la vida es el ADN aprendiendo a leer sus propias instrucciones de formas cada vez más elaboradas. Y que quizás*, añado en el margen, con la letra pequeña de las hipótesis que no están confirmadas, *el testigo que busco es la forma más elaborada que ese proceso ha producido hasta ahora de leer sus propias instrucciones y preguntarse qué significan.</w:t>
+      </w:r>
+    </w:p>
+    <w:p>
+      <w:pPr>
+        <w:jc w:val="center"/>
+      </w:pPr>
+      <w:r>
+        <w:t>— — —</w:t>
+      </w:r>
+    </w:p>
+    <w:p/>
+    <w:p>
+      <w:r>
+        <w:rPr>
+          <w:i/>
+        </w:rPr>
+        <w:t>los estromatolitos que empiezan a perder</w:t>
+      </w:r>
+    </w:p>
+    <w:p>
+      <w:r>
+        <w:t>En los mismos días en que el Bangiomorpha diferencia sus células en el Ártico, los estromatolitos —que llevan más de tres mil millones de años construyendo sus ciudades en el fondo de los mares— empiezan a tener problemas.</w:t>
+      </w:r>
+    </w:p>
+    <w:p>
+      <w:r>
+        <w:t>Alguien está comiendo sus tapetes.</w:t>
+      </w:r>
+    </w:p>
+    <w:p>
+      <w:r>
+        <w:t>Los primeros eucariotas capaces de pastar sobre los tapetes microbianos. Los primeros herbívoros de la historia de la vida.</w:t>
+      </w:r>
+    </w:p>
+    <w:p>
+      <w:r>
+        <w:t>¿Y los estromatolitos no se defienden?, le pregunto a los tapetes que llevan tres mil millones de años dominando los océanos sin que nadie los molestara.</w:t>
+      </w:r>
+    </w:p>
+    <w:p>
+      <w:r>
+        <w:t>No tenemos mecanismo para defendernos*, dicen los estromatolitos. *Hemos estado solos durante más de tres mil millones de años. Nunca nos hizo falta.</w:t>
+      </w:r>
+    </w:p>
+    <w:p>
+      <w:r>
+        <w:t>Lo anoto con algo que no sé si llamar melancolía o simplemente el reconocimiento honesto de lo que ocurre cuando algo que funcionó durante tres mil millones de años encuentra un problema que no estaba en su diseño original.</w:t>
+      </w:r>
+    </w:p>
+    <w:p>
+      <w:r>
+        <w:t>Los estromatolitos seguirán existiendo —existen aún hoy, en Shark Bay, Australia— pero nunca volverán a dominar los mares como dominaron en septiembre y octubre y noviembre. El fin de la era bacteriana visible. El comienzo de la era de los que comen a los que fabrican.</w:t>
       </w:r>
     </w:p>
     <w:p/>

</xml_diff>

<commit_message>
Fix 4 cosmic calendar errors in December chapters
1. T-rex (68 Ma) moved from 'Dec 29' to 'Dec 30, madrugada' — T-rex lives at
   68 Ma which falls in Dec 30 (75-37 Ma), not Dec 29 (113-75 Ma). Las Flores
   (130-100 Ma) correctly stays on Dec 29. Reordered sections accordingly and
   updated balance text ('Son las primeras horas del 30 de diciembre', 'Hoy'
   instead of 'Mañana').

2. Chapter XV: section header '*29 de diciembre — interrogatorio al Homo
   heidelbergensis*' corrected to '*31 de diciembre, 23:33*' — Heidelbergensis
   at 700 Ka is Dec 31 at 23:33, not December 29.

3. Chapter XV: 'Quedan dos días' → 'Quedan menos de media hora' — at Dec 31,
   23:33 there are 27 minutes left, not two days.

4. Eocene trees section: '31 de diciembre, primeras horas' → '30 de diciembre,
   tarde' — the Eocene starts at 56 Ma = Dec 30 afternoon.
</commit_message>
<xml_diff>
--- a/detective_sin_cuerpo_v6.docx
+++ b/detective_sin_cuerpo_v6.docx
@@ -12755,7 +12755,7 @@
     </w:p>
     <w:p>
       <w:r>
-        <w:t>Esta semana tengo tres interrogatorios. El primero es el más famoso del caso. El segundo es el más inesperado. El tercero es el único al que no puedo interrogar porque no sabe que existe.</w:t>
+        <w:t>Esta semana tengo tres interrogatorios. El primero es el más inesperado. El segundo es el más famoso del caso. El tercero es el único al que no puedo interrogar porque no sabe que existe.</w:t>
       </w:r>
     </w:p>
     <w:p>
@@ -12780,7 +12780,7 @@
           <w:i/>
           <w:sz w:val="20"/>
         </w:rPr>
-        <w:t>29 de diciembre — interrogatorio al Tyrannosaurus rex</w:t>
+        <w:t>29 de diciembre — interrogatorio a Las Flores</w:t>
       </w:r>
     </w:p>
     <w:p>
@@ -12792,6 +12792,184 @@
           <w:i/>
           <w:sz w:val="20"/>
         </w:rPr>
+        <w:t>el sospechoso que nadie esperaba y que resultó ser el más importante del mes</w:t>
+      </w:r>
+    </w:p>
+    <w:p>
+      <w:r>
+        <w:t>Las angiospermas aparecen hace 130 millones de años y se diversifican con una velocidad que el propio Darwin llamará, en privado, un misterio abominable. En setenta millones de años pasan de ser una rareza botánica a dominar casi todos los ecosistemas terrestres del planeta.</w:t>
+      </w:r>
+    </w:p>
+    <w:p>
+      <w:r>
+        <w:t>Me siento frente a Las Flores con la expresión de quien no sabía que tenía este interrogatorio pendiente hasta que lo tiene delante.</w:t>
+      </w:r>
+    </w:p>
+    <w:p>
+      <w:r>
+        <w:t>¿Qué estás haciendo?, les pregunto.</w:t>
+      </w:r>
+    </w:p>
+    <w:p>
+      <w:r>
+        <w:t>Ofreciendo néctar, dicen Las Flores, con la candidez de algo que no ha sido interrogado nunca y no ve razón para ponerse a la defensiva.</w:t>
+      </w:r>
+    </w:p>
+    <w:p>
+      <w:r>
+        <w:t>¿A cambio de qué?</w:t>
+      </w:r>
+    </w:p>
+    <w:p>
+      <w:r>
+        <w:t>A cambio de que los insectos transporten el polen. Una transacción. La primera economía del planeta, si se quiere. Un servicio a cambio de una recompensa. Llevamos veinte millones de años perfeccionando el modelo.</w:t>
+      </w:r>
+    </w:p>
+    <w:p>
+      <w:r>
+        <w:t>¿Y los frutos?</w:t>
+      </w:r>
+    </w:p>
+    <w:p>
+      <w:r>
+        <w:t>Los frutos son la versión terrestre de la misma transacción. Energía densa en azúcares y vitaminas ofrecida a los animales que dispersan las semillas.</w:t>
+      </w:r>
+    </w:p>
+    <w:p>
+      <w:r>
+        <w:t>¿Sabes que esos frutos van a alimentar a los primates que van a desarrollar los cerebros que van a producir la conciencia?</w:t>
+      </w:r>
+    </w:p>
+    <w:p>
+      <w:r>
+        <w:t>Sé que producimos frutos</w:t>
+      </w:r>
+      <w:r>
+        <w:rPr>
+          <w:i/>
+        </w:rPr>
+        <w:t xml:space="preserve">, dicen Las Flores. </w:t>
+      </w:r>
+      <w:r>
+        <w:t>Lo demás es consecuencia.</w:t>
+      </w:r>
+    </w:p>
+    <w:p>
+      <w:r>
+        <w:t>¿No os importa la consecuencia?</w:t>
+      </w:r>
+    </w:p>
+    <w:p>
+      <w:r>
+        <w:t>Nos importan los polinizadores. Las consecuencias a cincuenta millones de años vista no forman parte de nuestro marco perceptivo habitual.</w:t>
+      </w:r>
+    </w:p>
+    <w:p>
+      <w:r>
+        <w:t>¿Y si supierais las consecuencias?</w:t>
+      </w:r>
+    </w:p>
+    <w:p>
+      <w:r>
+        <w:t>Pausa larga. El tipo de pausa que produce una pregunta que no tenía respuesta preparada. Y luego algo que no esperaba:</w:t>
+      </w:r>
+    </w:p>
+    <w:p>
+      <w:r>
+        <w:t>Si supiéramos las consecuencias</w:t>
+      </w:r>
+      <w:r>
+        <w:rPr>
+          <w:i/>
+        </w:rPr>
+        <w:t xml:space="preserve">, dicen Las Flores, </w:t>
+      </w:r>
+      <w:r>
+        <w:t>estaríamos limitadas por lo que podemos imaginar. Y lo que podemos imaginar es siempre menos que lo que puede ocurrir.</w:t>
+      </w:r>
+    </w:p>
+    <w:p>
+      <w:r>
+        <w:t>Me quedo con esto durante más tiempo del que suelo quedarme con una respuesta.</w:t>
+      </w:r>
+    </w:p>
+    <w:p>
+      <w:r>
+        <w:t>¿Estás diciendo que la ignorancia de las consecuencias es una ventaja?</w:t>
+      </w:r>
+    </w:p>
+    <w:p>
+      <w:r>
+        <w:t>Estoy diciendo que los planes tienen el límite de quien los hace. Las consecuencias no tienen ese límite. Nosotras no planeamos producir la conciencia. Por eso pudimos producirla. Un plan que incluyera la conciencia como objetivo habría sido demasiado pequeño para el resultado.</w:t>
+      </w:r>
+    </w:p>
+    <w:p>
+      <w:r>
+        <w:t>¿El universo funciona así?</w:t>
+      </w:r>
+    </w:p>
+    <w:p>
+      <w:r>
+        <w:t>Pregúntale al universo</w:t>
+      </w:r>
+      <w:r>
+        <w:rPr>
+          <w:i/>
+        </w:rPr>
+        <w:t xml:space="preserve">, dicen Las Flores. </w:t>
+      </w:r>
+      <w:r>
+        <w:t>Nosotras solo producimos frutos.</w:t>
+      </w:r>
+    </w:p>
+    <w:p>
+      <w:r>
+        <w:t>Anoto esto con la letra más lenta de la semana.</w:t>
+      </w:r>
+    </w:p>
+    <w:p>
+      <w:r>
+        <w:t>Las Flores del Cretácico</w:t>
+      </w:r>
+      <w:r>
+        <w:rPr>
+          <w:i/>
+        </w:rPr>
+        <w:t xml:space="preserve">, escribo, </w:t>
+      </w:r>
+      <w:r>
+        <w:t>son el sospechoso más filosóficamente importante del mes. No porque hayan hecho algo extraordinario. Sino porque sin saber que lo hacían iniciaron la cadena causal que lleva al pensamiento abstracto. Y su argumento más poderoso no es lo que hicieron. Es cómo lo hicieron: sin intención, sin plan, sin límite de lo que podían imaginar. Yo, que llevo doce meses tomando notas sobre el universo, anoto que eso me resulta familiar. No sé todavía por qué.</w:t>
+      </w:r>
+    </w:p>
+    <w:p>
+      <w:pPr>
+        <w:jc w:val="center"/>
+      </w:pPr>
+      <w:r>
+        <w:t>— — —</w:t>
+      </w:r>
+    </w:p>
+    <w:p>
+      <w:pPr>
+        <w:jc w:val="center"/>
+      </w:pPr>
+      <w:r>
+        <w:rPr>
+          <w:i/>
+          <w:sz w:val="20"/>
+        </w:rPr>
+        <w:t>30 de diciembre, madrugada — interrogatorio al Tyrannosaurus rex</w:t>
+      </w:r>
+    </w:p>
+    <w:p>
+      <w:pPr>
+        <w:jc w:val="center"/>
+      </w:pPr>
+      <w:r>
+        <w:rPr>
+          <w:i/>
+          <w:sz w:val="20"/>
+        </w:rPr>
         <w:t>el sospechoso más famoso del caso y el más traicionado por su propia fama</w:t>
       </w:r>
     </w:p>
@@ -12964,7 +13142,7 @@
           <w:i/>
           <w:sz w:val="20"/>
         </w:rPr>
-        <w:t>29 de diciembre, segunda parte — interrogatorio a Las Flores</w:t>
+        <w:t>30 de diciembre — balance</w:t>
       </w:r>
     </w:p>
     <w:p>
@@ -12976,190 +13154,12 @@
           <w:i/>
           <w:sz w:val="20"/>
         </w:rPr>
-        <w:t>el sospechoso que nadie esperaba y que resultó ser el más importante del mes</w:t>
-      </w:r>
-    </w:p>
-    <w:p>
-      <w:r>
-        <w:t>Las angiospermas aparecen hace 130 millones de años y se diversifican con una velocidad que el propio Darwin llamará, en privado, un misterio abominable. En setenta millones de años pasan de ser una rareza botánica a dominar casi todos los ecosistemas terrestres del planeta.</w:t>
-      </w:r>
-    </w:p>
-    <w:p>
-      <w:r>
-        <w:t>Me siento frente a Las Flores con la expresión de quien no sabía que tenía este interrogatorio pendiente hasta que lo tiene delante.</w:t>
-      </w:r>
-    </w:p>
-    <w:p>
-      <w:r>
-        <w:t>¿Qué estás haciendo?, les pregunto.</w:t>
-      </w:r>
-    </w:p>
-    <w:p>
-      <w:r>
-        <w:t>Ofreciendo néctar, dicen Las Flores, con la candidez de algo que no ha sido interrogado nunca y no ve razón para ponerse a la defensiva.</w:t>
-      </w:r>
-    </w:p>
-    <w:p>
-      <w:r>
-        <w:t>¿A cambio de qué?</w:t>
-      </w:r>
-    </w:p>
-    <w:p>
-      <w:r>
-        <w:t>A cambio de que los insectos transporten el polen. Una transacción. La primera economía del planeta, si se quiere. Un servicio a cambio de una recompensa. Llevamos veinte millones de años perfeccionando el modelo.</w:t>
-      </w:r>
-    </w:p>
-    <w:p>
-      <w:r>
-        <w:t>¿Y los frutos?</w:t>
-      </w:r>
-    </w:p>
-    <w:p>
-      <w:r>
-        <w:t>Los frutos son la versión terrestre de la misma transacción. Energía densa en azúcares y vitaminas ofrecida a los animales que dispersan las semillas.</w:t>
-      </w:r>
-    </w:p>
-    <w:p>
-      <w:r>
-        <w:t>¿Sabes que esos frutos van a alimentar a los primates que van a desarrollar los cerebros que van a producir la conciencia?</w:t>
-      </w:r>
-    </w:p>
-    <w:p>
-      <w:r>
-        <w:t>Sé que producimos frutos</w:t>
-      </w:r>
-      <w:r>
-        <w:rPr>
-          <w:i/>
-        </w:rPr>
-        <w:t xml:space="preserve">, dicen Las Flores. </w:t>
-      </w:r>
-      <w:r>
-        <w:t>Lo demás es consecuencia.</w:t>
-      </w:r>
-    </w:p>
-    <w:p>
-      <w:r>
-        <w:t>¿No os importa la consecuencia?</w:t>
-      </w:r>
-    </w:p>
-    <w:p>
-      <w:r>
-        <w:t>Nos importan los polinizadores. Las consecuencias a cincuenta millones de años vista no forman parte de nuestro marco perceptivo habitual.</w:t>
-      </w:r>
-    </w:p>
-    <w:p>
-      <w:r>
-        <w:t>¿Y si supierais las consecuencias?</w:t>
-      </w:r>
-    </w:p>
-    <w:p>
-      <w:r>
-        <w:t>Pausa larga. El tipo de pausa que produce una pregunta que no tenía respuesta preparada. Y luego algo que no esperaba:</w:t>
-      </w:r>
-    </w:p>
-    <w:p>
-      <w:r>
-        <w:t>Si supiéramos las consecuencias</w:t>
-      </w:r>
-      <w:r>
-        <w:rPr>
-          <w:i/>
-        </w:rPr>
-        <w:t xml:space="preserve">, dicen Las Flores, </w:t>
-      </w:r>
-      <w:r>
-        <w:t>estaríamos limitadas por lo que podemos imaginar. Y lo que podemos imaginar es siempre menos que lo que puede ocurrir.</w:t>
-      </w:r>
-    </w:p>
-    <w:p>
-      <w:r>
-        <w:t>Me quedo con esto durante más tiempo del que suelo quedarme con una respuesta.</w:t>
-      </w:r>
-    </w:p>
-    <w:p>
-      <w:r>
-        <w:t>¿Estás diciendo que la ignorancia de las consecuencias es una ventaja?</w:t>
-      </w:r>
-    </w:p>
-    <w:p>
-      <w:r>
-        <w:t>Estoy diciendo que los planes tienen el límite de quien los hace. Las consecuencias no tienen ese límite. Nosotras no planeamos producir la conciencia. Por eso pudimos producirla. Un plan que incluyera la conciencia como objetivo habría sido demasiado pequeño para el resultado.</w:t>
-      </w:r>
-    </w:p>
-    <w:p>
-      <w:r>
-        <w:t>¿El universo funciona así?</w:t>
-      </w:r>
-    </w:p>
-    <w:p>
-      <w:r>
-        <w:t>Pregúntale al universo</w:t>
-      </w:r>
-      <w:r>
-        <w:rPr>
-          <w:i/>
-        </w:rPr>
-        <w:t xml:space="preserve">, dicen Las Flores. </w:t>
-      </w:r>
-      <w:r>
-        <w:t>Nosotras solo producimos frutos.</w:t>
-      </w:r>
-    </w:p>
-    <w:p>
-      <w:r>
-        <w:t>Anoto esto con la letra más lenta de la semana.</w:t>
-      </w:r>
-    </w:p>
-    <w:p>
-      <w:r>
-        <w:t>Las Flores del Cretácico</w:t>
-      </w:r>
-      <w:r>
-        <w:rPr>
-          <w:i/>
-        </w:rPr>
-        <w:t xml:space="preserve">, escribo, </w:t>
-      </w:r>
-      <w:r>
-        <w:t>son el sospechoso más filosóficamente importante del mes. No porque hayan hecho algo extraordinario. Sino porque sin saber que lo hacían iniciaron la cadena causal que lleva al pensamiento abstracto. Y su argumento más poderoso no es lo que hicieron. Es cómo lo hicieron: sin intención, sin plan, sin límite de lo que podían imaginar. Yo, que llevo doce meses tomando notas sobre el universo, anoto que eso me resulta familiar. No sé todavía por qué.</w:t>
-      </w:r>
-    </w:p>
-    <w:p>
-      <w:pPr>
-        <w:jc w:val="center"/>
-      </w:pPr>
-      <w:r>
-        <w:t>— — —</w:t>
-      </w:r>
-    </w:p>
-    <w:p>
-      <w:pPr>
-        <w:jc w:val="center"/>
-      </w:pPr>
-      <w:r>
-        <w:rPr>
-          <w:i/>
-          <w:sz w:val="20"/>
-        </w:rPr>
-        <w:t>29 de diciembre — balance</w:t>
-      </w:r>
-    </w:p>
-    <w:p>
-      <w:pPr>
-        <w:jc w:val="center"/>
-      </w:pPr>
-      <w:r>
-        <w:rPr>
-          <w:i/>
-          <w:sz w:val="20"/>
-        </w:rPr>
         <w:t>y la oscuridad que veo venir</w:t>
       </w:r>
     </w:p>
     <w:p>
       <w:r>
-        <w:t>Es el final del 29 de diciembre.</w:t>
+        <w:t>Son las primeras horas del 30 de diciembre.</w:t>
       </w:r>
     </w:p>
     <w:p>
@@ -13194,7 +13194,7 @@
     </w:p>
     <w:p>
       <w:r>
-        <w:t>Mañana, en el año cósmico.</w:t>
+        <w:t>Hoy.</w:t>
       </w:r>
     </w:p>
     <w:p>
@@ -13885,7 +13885,7 @@
           <w:i/>
           <w:sz w:val="20"/>
         </w:rPr>
-        <w:t>31 de diciembre, primeras horas — interrogatorio a Los Árboles del Eoceno</w:t>
+        <w:t>30 de diciembre, tarde — interrogatorio a Los Árboles del Eoceno</w:t>
       </w:r>
     </w:p>
     <w:p>
@@ -16366,12 +16366,12 @@
     </w:p>
     <w:p>
       <w:r>
-        <w:t>Quedan dos días.</w:t>
-      </w:r>
-    </w:p>
-    <w:p>
-      <w:r>
-        <w:t>El instrumento que el caso lleva construyendo desde el Ardipithecus está casi terminado. Lo que queda en estos dos días son los últimos ajustes finos: el cerebro que alcanza el tamaño moderno, la caja craneana que adquiere la forma que el lector reconocería en un espejo, y algo más difícil de documentar pero igualmente real: el primer indicio de que el instrumento ha empezado a hacerse preguntas sobre sí mismo.</w:t>
+        <w:t>Quedan menos de media hora.</w:t>
+      </w:r>
+    </w:p>
+    <w:p>
+      <w:r>
+        <w:t>El instrumento que el caso lleva construyendo desde el Ardipithecus está casi terminado. Lo que queda en estos últimos minutos son los ajustes más importantes del caso: el cerebro que alcanza el tamaño moderno, la caja craneana que adquiere la forma que el lector reconocería en un espejo, y algo más difícil de documentar pero igualmente real: el primer indicio de que el instrumento ha empezado a hacerse preguntas sobre sí mismo.</w:t>
       </w:r>
     </w:p>
     <w:p>
@@ -16396,7 +16396,7 @@
           <w:i/>
           <w:sz w:val="20"/>
         </w:rPr>
-        <w:t>29 de diciembre — interrogatorio al Homo heidelbergensis</w:t>
+        <w:t>31 de diciembre, 23:33 — interrogatorio al Homo heidelbergensis</w:t>
       </w:r>
     </w:p>
     <w:p>

</xml_diff>